<commit_message>
remove characters and non-insect calls
</commit_message>
<xml_diff>
--- a/docs/tables/table_owl_recordings.docx
+++ b/docs/tables/table_owl_recordings.docx
@@ -332,7 +332,7 @@
                 <w:rFonts w:ascii="Calibri" w:hAnsi="Calibri"/>
                 <w:sz w:val="20"/>
               </w:rPr>
-              <w:t xml:space="default">113</w:t>
+              <w:t xml:space="default">112</w:t>
             </w:r>
           </w:p>
         </w:tc>
@@ -404,7 +404,7 @@
                 <w:rFonts w:ascii="Calibri" w:hAnsi="Calibri"/>
                 <w:sz w:val="20"/>
               </w:rPr>
-              <w:t xml:space="default">34</w:t>
+              <w:t xml:space="default">33</w:t>
             </w:r>
           </w:p>
         </w:tc>

</xml_diff>

<commit_message>
edited the work note
</commit_message>
<xml_diff>
--- a/docs/tables/table_owl_recordings.docx
+++ b/docs/tables/table_owl_recordings.docx
@@ -1197,7 +1197,7 @@
                 <w:rFonts w:ascii="Calibri" w:hAnsi="Calibri"/>
                 <w:sz w:val="20"/>
               </w:rPr>
-              <w:t xml:space="default">13</w:t>
+              <w:t xml:space="default">11</w:t>
             </w:r>
           </w:p>
         </w:tc>
@@ -1293,7 +1293,7 @@
                 <w:rFonts w:ascii="Calibri" w:hAnsi="Calibri"/>
                 <w:sz w:val="20"/>
               </w:rPr>
-              <w:t xml:space="default">10</w:t>
+              <w:t xml:space="default">8</w:t>
             </w:r>
           </w:p>
         </w:tc>

</xml_diff>